<commit_message>
docs: update system architecture Word document v2 with Data Contract, Pre-Aggregation size optimization (34KB), and station key mappings
</commit_message>
<xml_diff>
--- a/Tai_Lieu_Ky_Thuat_System_Architecture_JFS_HUB.docx
+++ b/Tai_Lieu_Ky_Thuat_System_Architecture_JFS_HUB.docx
@@ -120,7 +120,7 @@
               <w:br/>
               <w:t>PostgreSQL (Database logistics_db — Schema enriched.dispatch_enriched - 28 Cột)</w:t>
               <w:br/>
-              <w:t xml:space="preserve">   ↓ (sync_postgre.py — JSON Exporter &amp; Data Aggregator)</w:t>
+              <w:t xml:space="preserve">   ↓ (sync_postgre.py — JSON Exporter &amp; Data Aggregator | Windows Task Scheduler 'Sync_Postgre_30m' 30m/lần)</w:t>
               <w:br/>
               <w:t>Thư mục data/*.json &amp; latest.json.gz (Repository Data Files)</w:t>
               <w:br/>
@@ -149,21 +149,7 @@
           <w:color w:val="102C57"/>
           <w:sz w:val="32"/>
         </w:rPr>
-        <w:t>2. 19 NGUYÊN TẮC KỸ THUẬT CỐT LÕI</w:t>
-      </w:r>
-    </w:p>
-    <w:p>
-      <w:pPr>
-        <w:spacing w:before="0" w:after="80" w:line="276" w:lineRule="auto"/>
-      </w:pPr>
-      <w:r>
-        <w:rPr>
-          <w:rFonts w:ascii="Calibri" w:hAnsi="Calibri"/>
-          <w:b w:val="0"/>
-          <w:i w:val="0"/>
-          <w:sz w:val="22"/>
-        </w:rPr>
-        <w:t>Dưới đây là 19 nguyên tắc vận hành được lập trình trực tiếp trong mã nguồn Backend và Frontend để bảo đảm tính chính xác 100% của số liệu báo cáo:</w:t>
+        <w:t>2. CÁC NGUYÊN TẮC KỸ THUẬT CỐT LÕI (ĐÃ CHUẨN HÓA)</w:t>
       </w:r>
     </w:p>
     <w:p>
@@ -282,14 +268,14 @@
           <w:b/>
           <w:sz w:val="22"/>
         </w:rPr>
-        <w:t>6. Phân loại cờ Vận hành (Operational Flags):</w:t>
+        <w:t>6. Phân loại cờ Vận hành &amp; Baseline Rớt Hôm Trước 06:00 AM:</w:t>
       </w:r>
       <w:r>
         <w:rPr>
           <w:rFonts w:ascii="Calibri" w:hAnsi="Calibri"/>
           <w:sz w:val="22"/>
         </w:rPr>
-        <w:t xml:space="preserve"> Tự động tính 3 cờ dưới DB: `is_backlog = 1` (đã Inbound nhưng chưa Outbound), `is_active = 0` (đã Outbound), `is_transit = 1` (đã Inbound + Arrival nhưng chưa Outbound).</w:t>
+        <w:t xml:space="preserve"> Chốt cố định Baseline `rot_hom_truoc` lúc 06:00 AM trong bảng `enriched.daily_baseline_snapshot` cho Inbound Dashboard (giữ nguyên không giảm để làm báo cáo ca). Đồng thời duy trì `rot_hom_truoc_live` giảm động theo thời gian thực trên Thẻ Volume Layout Dashboard cho team Outbound xử lý.</w:t>
       </w:r>
     </w:p>
     <w:p>
@@ -303,14 +289,14 @@
           <w:b/>
           <w:sz w:val="22"/>
         </w:rPr>
-        <w:t>7. Chuẩn hóa Mã Bưu cục (Master Data Mapping):</w:t>
+        <w:t>7. Chuẩn hóa Mã Bưu cục (Master Data Driven):</w:t>
       </w:r>
       <w:r>
         <w:rPr>
           <w:rFonts w:ascii="Calibri" w:hAnsi="Calibri"/>
           <w:sz w:val="22"/>
         </w:rPr>
-        <w:t xml:space="preserve"> Đọc `valid.csv` để tra cứu `dict_zone`, `dict_area`, `dict_station`. Ưu tiên lookup bằng `dispatch_code` (sortcode 10 ký tự), nếu rỗng fallback sang `next_station`.</w:t>
+        <w:t xml:space="preserve"> Đọc `valid.csv` để tra cứu `dict_zone`, `dict_area`, `dict_station`. Ưu tiên lookup bằng `dispatch_code` (sortcode 10 ký tự), nếu rỗng fallback sang `next_station`. Toàn bộ cấu trúc khu vực, sức chứa (capacity) được đọc tự động 100% từ Master Config, loại bỏ hoàn toàn việc ghi đè cứng trong code.</w:t>
       </w:r>
     </w:p>
     <w:p>
@@ -324,14 +310,14 @@
           <w:b/>
           <w:sz w:val="22"/>
         </w:rPr>
-        <w:t>8. Ghi đè luồng Miền Bắc (BN HUB Override):</w:t>
+        <w:t>8. Trích xuất Trạm nguồn &amp; Region Tagging (is_north/region):</w:t>
       </w:r>
       <w:r>
         <w:rPr>
           <w:rFonts w:ascii="Calibri" w:hAnsi="Calibri"/>
           <w:sz w:val="22"/>
         </w:rPr>
-        <w:t xml:space="preserve"> Nếu `next_station == 'BN HUB'` hoặc sortcode bắt đầu bằng `BNI`, hệ thống ép cứng về cụm quản lý `area_id = 'A06'`, `zone = '1'` và `capacity = 1400`.</w:t>
+        <w:t xml:space="preserve"> Trích xuất trực tiếp `upOrNextStation` và `sendSite`. Backend tự động gắn thuộc tính `is_north` và `region` ('north'/'south') cho từng record trong `inbound.json` từ Master Config (`valid.csv` -&gt; `dict_zone`). Đã loại bỏ hoàn toàn danh sách cứng `NORTH_POST_OFFICES` và 11 lần gọi `isNorthStation` ở Frontend.</w:t>
       </w:r>
     </w:p>
     <w:p>
@@ -345,14 +331,14 @@
           <w:b/>
           <w:sz w:val="22"/>
         </w:rPr>
-        <w:t>9. Cấu trúc Gom cụm Aggregate (inbound_group):</w:t>
+        <w:t>9. Cấu trúc Gom cụm Aggregate (15-Tuple Key):</w:t>
       </w:r>
       <w:r>
         <w:rPr>
           <w:rFonts w:ascii="Calibri" w:hAnsi="Calibri"/>
           <w:sz w:val="22"/>
         </w:rPr>
-        <w:t xml:space="preserve"> Gom nhóm dữ liệu theo 14-tuple key (bưu cục, trạng thái, 4 ngày vận hành, 4 mốc giờ, drop_type, trip_code, thời gian xe). Cộng dồn `volume += 1` và `weight_kg += orders_weight`.</w:t>
+        <w:t xml:space="preserve"> Gom nhóm dữ liệu theo 15-tuple key (bưu cục, trạng thái, 4 ngày vận hành, 4 mốc giờ, drop_type, trip_code, thời gian xe, is_rebound). Cộng dồn `volume += 1` và `weight_kg += orders_weight` để nén file JSON siêu nhẹ mà vẫn giữ đủ độ phân giải phân tích.</w:t>
       </w:r>
     </w:p>
     <w:p>
@@ -366,14 +352,14 @@
           <w:b/>
           <w:sz w:val="22"/>
         </w:rPr>
-        <w:t>10. Đơn vị Trọng lượng Chuẩn hóa (Weight Unit Backend):</w:t>
+        <w:t>10. Quy chuẩn Đơn vị Trọng lượng Đồng nhất (Tấn - Single Source of Truth):</w:t>
       </w:r>
       <w:r>
         <w:rPr>
           <w:rFonts w:ascii="Calibri" w:hAnsi="Calibri"/>
           <w:sz w:val="22"/>
         </w:rPr>
-        <w:t xml:space="preserve"> Chỉ số trọng lượng được quy chuẩn lưu trữ duy nhất dưới dạng Tấn: `weight_ton = weight_kg / 1000`.</w:t>
+        <w:t xml:space="preserve"> Chỉ số trọng lượng được quy chuẩn lưu trữ duy nhất dưới dạng Tấn từ Backend ETL (`weight_ton = weight_kg / 1000`). Frontend đọc thẳng số từ JSON và append chuỗi 'Tấn' lên UI, loại bỏ hoàn toàn các hàm quy đổi 2 lần hay đoán đơn vị rủi ro.</w:t>
       </w:r>
     </w:p>
     <w:p>
@@ -387,14 +373,14 @@
           <w:b/>
           <w:sz w:val="22"/>
         </w:rPr>
-        <w:t>11. Đơn vị Trọng lượng Chuẩn hóa (Weight Unit Frontend):</w:t>
+        <w:t>11. Phân slot Giờ Heatmap (Hourly Bucket):</w:t>
       </w:r>
       <w:r>
         <w:rPr>
           <w:rFonts w:ascii="Calibri" w:hAnsi="Calibri"/>
           <w:sz w:val="22"/>
         </w:rPr>
-        <w:t xml:space="preserve"> React Frontend đọc thẳng số từ JSON và append chuỗi 'Tấn' lên giao diện, loại bỏ hoàn toàn các hàm đoán đơn vị if-else chập chờn trước đây.</w:t>
+        <w:t xml:space="preserve"> Tạo 24 slot giờ (`00:00` - `23:00`), lọc các đơn đã Inbound có `op_date_inbound == today` để đếm tần suất nhập kho theo khung giờ cao điểm.</w:t>
       </w:r>
     </w:p>
     <w:p>
@@ -408,14 +394,14 @@
           <w:b/>
           <w:sz w:val="22"/>
         </w:rPr>
-        <w:t>12. Bộ lọc Cửa sổ Thời gian 2 Ngày (Rolling Window):</w:t>
+        <w:t>12. Chuẩn hóa Trạng thái từ Nguồn Backend (clean_status_sys):</w:t>
       </w:r>
       <w:r>
         <w:rPr>
           <w:rFonts w:ascii="Calibri" w:hAnsi="Calibri"/>
           <w:sz w:val="22"/>
         </w:rPr>
-        <w:t xml:space="preserve"> Lọc `inbound_group` chỉ chứa dữ liệu Hôm nay (`today`) và Hôm qua (`yesterday`) để giữ kích thước JSON tối ưu mà vẫn đủ số liệu so sánh rớt đơn.</w:t>
+        <w:t xml:space="preserve"> Triển khai hàm `clean_status_sys()` trong `sync_postgre.py` quy đổi tất cả alias thô từ API về bộ 5 enum chuẩn (`Inbound`, `Transporting`, `Pickup Done`, `Created`, `Outbound`) ngay tại tầng Backend ETL trước khi đẩy vào PostgreSQL.</w:t>
       </w:r>
     </w:p>
     <w:p>
@@ -429,14 +415,14 @@
           <w:b/>
           <w:sz w:val="22"/>
         </w:rPr>
-        <w:t>13. Phân loại Rớt đơn không gán mặc định (Strict Drop Type):</w:t>
+        <w:t>13. Chế độ Môi trường Linh hoạt (Dual Hostname Fetching):</w:t>
       </w:r>
       <w:r>
         <w:rPr>
           <w:rFonts w:ascii="Calibri" w:hAnsi="Calibri"/>
           <w:sz w:val="22"/>
         </w:rPr>
-        <w:t xml:space="preserve"> Backend gán `'rot_today'` nếu `op_date_forecast == today`, ngược lại `'rot_yesterday'`. Frontend `normalizeDropType('')` trả về chuỗi rỗng chứ không gán mặc định rớt.</w:t>
+        <w:t xml:space="preserve"> Tự động phát hiện môi trường: Nếu chạy trên `github.io` sẽ fetch CDN Raw GitHub Pages kèm parameter timestamp (`?t=Date.now()`); nếu chạy local sẽ fetch `./data/`.</w:t>
       </w:r>
     </w:p>
     <w:p>
@@ -450,14 +436,14 @@
           <w:b/>
           <w:sz w:val="22"/>
         </w:rPr>
-        <w:t>14. Phân slot Giờ Heatmap (Hourly Bucket):</w:t>
+        <w:t>14. Tải nén File latest.json.gz qua Native DecompressionStream &amp; Smart Polling:</w:t>
       </w:r>
       <w:r>
         <w:rPr>
           <w:rFonts w:ascii="Calibri" w:hAnsi="Calibri"/>
           <w:sz w:val="22"/>
         </w:rPr>
-        <w:t xml:space="preserve"> Tạo 24 slot giờ (`00:00` - `23:00`), lọc các đơn đã Inbound có `op_date_inbound == today` để đếm tần suất nhập kho theo khung giờ.</w:t>
+        <w:t xml:space="preserve"> Backend nén `inbound.json` (37MB) thành `latest.json.gz` (271KB). Frontend React sử dụng API native `DecompressionStream('gzip')` giải nén trực tiếp trên trình duyệt, giảm 98% dung lượng tải lần đầu. Đồng thời triển khai Smart Polling 60s kiểm tra `last_update.json` trước khi refetch để bảo vệ CDN cache.</w:t>
       </w:r>
     </w:p>
     <w:p>
@@ -471,14 +457,14 @@
           <w:b/>
           <w:sz w:val="22"/>
         </w:rPr>
-        <w:t>15. Ánh xạ Tên thuộc tính Đa ngữ cảnh (Dual Key Mapping):</w:t>
+        <w:t>15. Tự động hóa Tiến trình ETL bằng Windows Task Scheduler (30 phút/lần):</w:t>
       </w:r>
       <w:r>
         <w:rPr>
           <w:rFonts w:ascii="Calibri" w:hAnsi="Calibri"/>
           <w:sz w:val="22"/>
         </w:rPr>
-        <w:t xml:space="preserve"> Hàm `fetchInboundSheetData` tự động nhân bản song song key tiếng Anh (`station_name`, `status`, `volume`, `weight_ton`) và tiếng Việt (`Bưu cục`, `Trạng thái`, `Volume`, `Weight`) để tương thích mọi UI Component.</w:t>
+        <w:t xml:space="preserve"> Cấu hình Task Scheduler tự động kích hoạt `sync_postgre.py` định kỳ 30 phút/lần qua task `Sync_Postgre_30m`. Sử dụng wrapper script `run_sync_postgre.bat` thiết lập môi trường UTF-8, chuyển working directory chuẩn và tự động ghi log hoạt động chi tiết vào `sync_postgre.log`. Đồng thời tích hợp kịch bản khởi tạo PowerShell `setup_sync_postgre_task.ps1` để tự động hóa toàn bộ quy trình triển khai dịch vụ 24/7.</w:t>
       </w:r>
     </w:p>
     <w:p>
@@ -492,14 +478,14 @@
           <w:b/>
           <w:sz w:val="22"/>
         </w:rPr>
-        <w:t>16. Chuẩn hóa Trạng thái Frontend (Status Normalization):</w:t>
+        <w:t>16. Hợp đồng Dữ liệu Trung tâm (Data Contract Single Source of Truth):</w:t>
       </w:r>
       <w:r>
         <w:rPr>
           <w:rFonts w:ascii="Calibri" w:hAnsi="Calibri"/>
           <w:sz w:val="22"/>
         </w:rPr>
-        <w:t xml:space="preserve"> Hàm `normalizeStatus()` quy đổi tất cả alias (`at_hub`, `Đang trên bãi`, `pickup_done`...) về bộ enum chuẩn (`Inbound`, `Transporting`, `Pickup Done`, `Created`, `Outbound`).</w:t>
+        <w:t xml:space="preserve"> Triển khai đặc tả hợp đồng dữ liệu tập trung `data_contract.json` (Backend) và `data_contract.ts` (Frontend) đóng vai trò là Nguồn Chân Lý Duy Nhất. Định nghĩa cứng tập enum trạng thái Display-Ready (`Inbound`, `Transporting`, `Pickup Done`, `Created`, `Outbound`), quy chuẩn đơn vị `weight_ton` (Tấn, hiển thị trực tiếp không tính toán lại ở Frontend) và bảng ánh xạ key. Đặc biệt: Phân định rõ ràng `station_name` ↔ `Bưu cục đích` (định hướng ô chứa/tuyến) với `pickup_station` ↔ `Bưu cục nộp/lấy hàng` (trạm nguồn) tránh nhầm lẫn giữa 2 đầu bưu cục. Backend chạy kiểm tra `validate_payload_contract()` trước khi xuất file JSON, ngăn ngừa triệt để mọi rủi ro tái phát lỗi sai format hay lệch enum.</w:t>
       </w:r>
     </w:p>
     <w:p>
@@ -513,56 +499,14 @@
           <w:b/>
           <w:sz w:val="22"/>
         </w:rPr>
-        <w:t>17. Loại trừ Trạm Miền Bắc khỏi Biểu đồ Inbound:</w:t>
+        <w:t>17. Tối ưu hóa Gom cụm Pre-Aggregation &amp; Giảm 83% Dung lượng Payload:</w:t>
       </w:r>
       <w:r>
         <w:rPr>
           <w:rFonts w:ascii="Calibri" w:hAnsi="Calibri"/>
           <w:sz w:val="22"/>
         </w:rPr>
-        <w:t xml:space="preserve"> Hàm `isNorthStation()` lọc bỏ các trạm thuộc cụm BẮC NINH / HÀ NỘI khỏi biểu đồ sản lượng nhập kho HUB HCM.</w:t>
-      </w:r>
-    </w:p>
-    <w:p>
-      <w:pPr>
-        <w:pStyle w:val="ListBullet"/>
-        <w:spacing w:before="0" w:after="60" w:line="276" w:lineRule="auto"/>
-      </w:pPr>
-      <w:r>
-        <w:rPr>
-          <w:rFonts w:ascii="Calibri" w:hAnsi="Calibri"/>
-          <w:b/>
-          <w:sz w:val="22"/>
-        </w:rPr>
-        <w:t>18. Chế độ Môi trường Linh hoạt (Dual Hostname Fetching):</w:t>
-      </w:r>
-      <w:r>
-        <w:rPr>
-          <w:rFonts w:ascii="Calibri" w:hAnsi="Calibri"/>
-          <w:sz w:val="22"/>
-        </w:rPr>
-        <w:t xml:space="preserve"> Tự động phát hiện môi trường: Nếu chạy trên `github.io` sẽ fetch CDN Raw GitHub Pages kèm timestamp chống cache (`?t=Date.now()`); nếu chạy local sẽ fetch `./data/`.</w:t>
-      </w:r>
-    </w:p>
-    <w:p>
-      <w:pPr>
-        <w:pStyle w:val="ListBullet"/>
-        <w:spacing w:before="0" w:after="60" w:line="276" w:lineRule="auto"/>
-      </w:pPr>
-      <w:r>
-        <w:rPr>
-          <w:rFonts w:ascii="Calibri" w:hAnsi="Calibri"/>
-          <w:b/>
-          <w:sz w:val="22"/>
-        </w:rPr>
-        <w:t>19. Tách CI/CD Build khỏi Data Storage &amp; Nén File:</w:t>
-      </w:r>
-      <w:r>
-        <w:rPr>
-          <w:rFonts w:ascii="Calibri" w:hAnsi="Calibri"/>
-          <w:sz w:val="22"/>
-        </w:rPr>
-        <w:t xml:space="preserve"> Cấu hình `.github/workflows/deploy.yml` chỉ trigger build React khi sửa code (`paths: ['src/**']`). Python push JSON không làm kích hoạt CI/CD. Đã nén `inbound.json` (37MB) thành `latest.json.gz` (271KB).</w:t>
+        <w:t xml:space="preserve"> Tối ưu hóa thuật toán gom nhóm 15-tuple key trong `sync_postgre.py`: Với các đơn đã `Inbound` thành công, thu gọn các mốc giờ lịch sử cũ; với các đơn chưa `Inbound`, bucket thời gian theo khung GIỜ `HH:00:00` thay vì định dạng PHÚT (`:16`). Kết quả làm giảm số dòng trong `inbound.json` từ 13,264 dòng xuống chỉ còn 2,493 dòng (giảm 81% số dòng), giảm dung lượng file thô từ 8.3MB xuống 1.4MB (giảm 83%), và dung lượng file nén `latest.json.gz` giảm từ 271KB xuống chỉ còn 34KB siêu nhẹ, giúp trang web load cực nhanh trên mọi thiết bị.</w:t>
       </w:r>
     </w:p>
     <w:p>
@@ -2461,7 +2405,7 @@
                 <w:color w:val="282828"/>
                 <w:sz w:val="19"/>
               </w:rPr>
-              <w:t>rec.get('orderStatusName')</w:t>
+              <w:t>clean_status_sys(orderStatusName)</w:t>
             </w:r>
           </w:p>
         </w:tc>
@@ -2483,7 +2427,7 @@
                 <w:color w:val="282828"/>
                 <w:sz w:val="19"/>
               </w:rPr>
-              <w:t>Trạng thái gốc OMS JFS</w:t>
+              <w:t>Trạng thái chuẩn hoá (Inbound, Pickup Done...)</w:t>
             </w:r>
           </w:p>
         </w:tc>
@@ -5320,7 +5264,7 @@
           <w:i w:val="0"/>
           <w:sz w:val="22"/>
         </w:rPr>
-        <w:t>Chi tiết 8 file JSON được tạo ra từ PostgreSQL và cách Frontend React tiêu thụ dữ liệu:</w:t>
+        <w:t>Chi tiết 11 file JSON chính thức được tạo ra từ PostgreSQL và cách Frontend React tiêu thụ dữ liệu:</w:t>
       </w:r>
     </w:p>
     <w:tbl>
@@ -5482,7 +5426,7 @@
                 <w:color w:val="282828"/>
                 <w:sz w:val="19"/>
               </w:rPr>
-              <w:t>Gom nhóm theo 14 trường mốc giờ + bưu cục + trạng thái. Chứa volume, weight_ton, trip_code, drop_type...</w:t>
+              <w:t>Gom nhóm theo 15-tuple key + field is_north/region. Chứa volume, weight_ton, trip_code, drop_type, is_rebound...</w:t>
             </w:r>
           </w:p>
         </w:tc>
@@ -5504,7 +5448,7 @@
                 <w:color w:val="282828"/>
                 <w:sz w:val="19"/>
               </w:rPr>
-              <w:t>InboundDashboard.tsx</w:t>
+              <w:t>InboundDashboard.tsx (App.tsx giải nén gzip)</w:t>
             </w:r>
           </w:p>
         </w:tc>
@@ -5684,7 +5628,7 @@
                 <w:color w:val="282828"/>
                 <w:sz w:val="19"/>
               </w:rPr>
-              <w:t>App.tsx (Filter Outbound)</w:t>
+              <w:t>App.tsx (Data Availability)</w:t>
             </w:r>
           </w:p>
         </w:tc>
@@ -5706,7 +5650,7 @@
                 <w:color w:val="282828"/>
                 <w:sz w:val="19"/>
               </w:rPr>
-              <w:t>Hiển thị sản lượng hàng đã xuất khỏi kho HUB gửi đi trạm.</w:t>
+              <w:t>Dữ liệu sẵn sàng trên GitHub Pages cho Outbound tracking.</w:t>
             </w:r>
           </w:p>
         </w:tc>
@@ -6282,6 +6226,609 @@
     </w:p>
     <w:p>
       <w:pPr>
+        <w:keepNext/>
+        <w:spacing w:before="320" w:after="120"/>
+      </w:pPr>
+      <w:r>
+        <w:rPr>
+          <w:rFonts w:ascii="Segoe UI" w:hAnsi="Segoe UI"/>
+          <w:b/>
+          <w:color w:val="102C57"/>
+          <w:sz w:val="32"/>
+        </w:rPr>
+        <w:t>7. CƠ CHẾ TỰ ĐỘNG HÓA TIẾN TRÌNH &amp; GIÁM SÁT NHẬT KÝ (AUTO-SYNC &amp; LOGGING)</w:t>
+      </w:r>
+    </w:p>
+    <w:p>
+      <w:pPr>
+        <w:spacing w:before="0" w:after="80" w:line="276" w:lineRule="auto"/>
+      </w:pPr>
+      <w:r>
+        <w:rPr>
+          <w:rFonts w:ascii="Calibri" w:hAnsi="Calibri"/>
+          <w:b w:val="0"/>
+          <w:i w:val="0"/>
+          <w:sz w:val="22"/>
+        </w:rPr>
+        <w:t>Hệ thống triển khai cơ chế đồng bộ tự động 24/7 và giám sát nhật ký vận hành đa tầng như sau:</w:t>
+      </w:r>
+    </w:p>
+    <w:tbl>
+      <w:tblPr>
+        <w:tblW w:type="auto" w:w="0"/>
+        <w:jc w:val="center"/>
+        <w:tblLook w:firstColumn="1" w:firstRow="1" w:lastColumn="0" w:lastRow="0" w:noHBand="0" w:noVBand="1" w:val="04A0"/>
+      </w:tblPr>
+      <w:tblGrid>
+        <w:gridCol w:w="2484"/>
+        <w:gridCol w:w="2484"/>
+        <w:gridCol w:w="2484"/>
+        <w:gridCol w:w="2484"/>
+      </w:tblGrid>
+      <w:tr>
+        <w:tc>
+          <w:tcPr>
+            <w:tcW w:type="dxa" w:w="2592"/>
+            <w:shd w:val="clear" w:color="auto" w:fill="1E5A96"/>
+            <w:tcMar>
+              <w:top w:w="120" w:type="dxa"/>
+              <w:bottom w:w="120" w:type="dxa"/>
+              <w:left w:w="120" w:type="dxa"/>
+              <w:right w:w="120" w:type="dxa"/>
+            </w:tcMar>
+          </w:tcPr>
+          <w:p>
+            <w:pPr>
+              <w:jc w:val="left"/>
+            </w:pPr>
+            <w:r>
+              <w:rPr>
+                <w:rFonts w:ascii="Segoe UI" w:hAnsi="Segoe UI"/>
+                <w:b/>
+                <w:color w:val="FFFFFF"/>
+                <w:sz w:val="19"/>
+              </w:rPr>
+              <w:t>Thành Phần Vận Hành</w:t>
+            </w:r>
+          </w:p>
+        </w:tc>
+        <w:tc>
+          <w:tcPr>
+            <w:tcW w:type="dxa" w:w="1872"/>
+            <w:shd w:val="clear" w:color="auto" w:fill="1E5A96"/>
+            <w:tcMar>
+              <w:top w:w="120" w:type="dxa"/>
+              <w:bottom w:w="120" w:type="dxa"/>
+              <w:left w:w="120" w:type="dxa"/>
+              <w:right w:w="120" w:type="dxa"/>
+            </w:tcMar>
+          </w:tcPr>
+          <w:p>
+            <w:pPr>
+              <w:jc w:val="left"/>
+            </w:pPr>
+            <w:r>
+              <w:rPr>
+                <w:rFonts w:ascii="Segoe UI" w:hAnsi="Segoe UI"/>
+                <w:b/>
+                <w:color w:val="FFFFFF"/>
+                <w:sz w:val="19"/>
+              </w:rPr>
+              <w:t>Loại / Công Cụ</w:t>
+            </w:r>
+          </w:p>
+        </w:tc>
+        <w:tc>
+          <w:tcPr>
+            <w:tcW w:type="dxa" w:w="3168"/>
+            <w:shd w:val="clear" w:color="auto" w:fill="1E5A96"/>
+            <w:tcMar>
+              <w:top w:w="120" w:type="dxa"/>
+              <w:bottom w:w="120" w:type="dxa"/>
+              <w:left w:w="120" w:type="dxa"/>
+              <w:right w:w="120" w:type="dxa"/>
+            </w:tcMar>
+          </w:tcPr>
+          <w:p>
+            <w:pPr>
+              <w:jc w:val="left"/>
+            </w:pPr>
+            <w:r>
+              <w:rPr>
+                <w:rFonts w:ascii="Segoe UI" w:hAnsi="Segoe UI"/>
+                <w:b/>
+                <w:color w:val="FFFFFF"/>
+                <w:sz w:val="19"/>
+              </w:rPr>
+              <w:t>Đường Dẫn / Tên Cấu Hình</w:t>
+            </w:r>
+          </w:p>
+        </w:tc>
+        <w:tc>
+          <w:tcPr>
+            <w:tcW w:type="dxa" w:w="2448"/>
+            <w:shd w:val="clear" w:color="auto" w:fill="1E5A96"/>
+            <w:tcMar>
+              <w:top w:w="120" w:type="dxa"/>
+              <w:bottom w:w="120" w:type="dxa"/>
+              <w:left w:w="120" w:type="dxa"/>
+              <w:right w:w="120" w:type="dxa"/>
+            </w:tcMar>
+          </w:tcPr>
+          <w:p>
+            <w:pPr>
+              <w:jc w:val="left"/>
+            </w:pPr>
+            <w:r>
+              <w:rPr>
+                <w:rFonts w:ascii="Segoe UI" w:hAnsi="Segoe UI"/>
+                <w:b/>
+                <w:color w:val="FFFFFF"/>
+                <w:sz w:val="19"/>
+              </w:rPr>
+              <w:t>Mô Tả &amp; Logic Kỹ Thuật</w:t>
+            </w:r>
+          </w:p>
+        </w:tc>
+      </w:tr>
+      <w:tr>
+        <w:tc>
+          <w:tcPr>
+            <w:tcW w:type="dxa" w:w="2592"/>
+            <w:shd w:val="clear" w:color="auto" w:fill="FFFFFF"/>
+            <w:tcMar>
+              <w:top w:w="100" w:type="dxa"/>
+              <w:bottom w:w="100" w:type="dxa"/>
+              <w:left w:w="120" w:type="dxa"/>
+              <w:right w:w="120" w:type="dxa"/>
+            </w:tcMar>
+          </w:tcPr>
+          <w:p>
+            <w:r>
+              <w:rPr>
+                <w:rFonts w:ascii="Calibri" w:hAnsi="Calibri"/>
+                <w:color w:val="282828"/>
+                <w:sz w:val="19"/>
+              </w:rPr>
+              <w:t>Scheduled Task</w:t>
+            </w:r>
+          </w:p>
+        </w:tc>
+        <w:tc>
+          <w:tcPr>
+            <w:tcW w:type="dxa" w:w="1872"/>
+            <w:shd w:val="clear" w:color="auto" w:fill="FFFFFF"/>
+            <w:tcMar>
+              <w:top w:w="100" w:type="dxa"/>
+              <w:bottom w:w="100" w:type="dxa"/>
+              <w:left w:w="120" w:type="dxa"/>
+              <w:right w:w="120" w:type="dxa"/>
+            </w:tcMar>
+          </w:tcPr>
+          <w:p>
+            <w:r>
+              <w:rPr>
+                <w:rFonts w:ascii="Calibri" w:hAnsi="Calibri"/>
+                <w:color w:val="282828"/>
+                <w:sz w:val="19"/>
+              </w:rPr>
+              <w:t>Windows Task Scheduler</w:t>
+            </w:r>
+          </w:p>
+        </w:tc>
+        <w:tc>
+          <w:tcPr>
+            <w:tcW w:type="dxa" w:w="3168"/>
+            <w:shd w:val="clear" w:color="auto" w:fill="FFFFFF"/>
+            <w:tcMar>
+              <w:top w:w="100" w:type="dxa"/>
+              <w:bottom w:w="100" w:type="dxa"/>
+              <w:left w:w="120" w:type="dxa"/>
+              <w:right w:w="120" w:type="dxa"/>
+            </w:tcMar>
+          </w:tcPr>
+          <w:p>
+            <w:r>
+              <w:rPr>
+                <w:rFonts w:ascii="Calibri" w:hAnsi="Calibri"/>
+                <w:color w:val="282828"/>
+                <w:sz w:val="19"/>
+              </w:rPr>
+              <w:t>Task Name: Sync_Postgre_30m</w:t>
+            </w:r>
+          </w:p>
+        </w:tc>
+        <w:tc>
+          <w:tcPr>
+            <w:tcW w:type="dxa" w:w="2448"/>
+            <w:shd w:val="clear" w:color="auto" w:fill="FFFFFF"/>
+            <w:tcMar>
+              <w:top w:w="100" w:type="dxa"/>
+              <w:bottom w:w="100" w:type="dxa"/>
+              <w:left w:w="120" w:type="dxa"/>
+              <w:right w:w="120" w:type="dxa"/>
+            </w:tcMar>
+          </w:tcPr>
+          <w:p>
+            <w:r>
+              <w:rPr>
+                <w:rFonts w:ascii="Calibri" w:hAnsi="Calibri"/>
+                <w:color w:val="282828"/>
+                <w:sz w:val="19"/>
+              </w:rPr>
+              <w:t>Tự động kích hoạt định kỳ mỗi 30 phút (RepetitionInterval 30m, vô thời hạn). Chạy dưới quyền tài khoản người dùng đăng nhập.</w:t>
+            </w:r>
+          </w:p>
+        </w:tc>
+      </w:tr>
+      <w:tr>
+        <w:tc>
+          <w:tcPr>
+            <w:tcW w:type="dxa" w:w="2592"/>
+            <w:shd w:val="clear" w:color="auto" w:fill="F9FAFC"/>
+            <w:tcMar>
+              <w:top w:w="100" w:type="dxa"/>
+              <w:bottom w:w="100" w:type="dxa"/>
+              <w:left w:w="120" w:type="dxa"/>
+              <w:right w:w="120" w:type="dxa"/>
+            </w:tcMar>
+          </w:tcPr>
+          <w:p>
+            <w:r>
+              <w:rPr>
+                <w:rFonts w:ascii="Calibri" w:hAnsi="Calibri"/>
+                <w:color w:val="282828"/>
+                <w:sz w:val="19"/>
+              </w:rPr>
+              <w:t>Batch Launcher</w:t>
+            </w:r>
+          </w:p>
+        </w:tc>
+        <w:tc>
+          <w:tcPr>
+            <w:tcW w:type="dxa" w:w="1872"/>
+            <w:shd w:val="clear" w:color="auto" w:fill="F9FAFC"/>
+            <w:tcMar>
+              <w:top w:w="100" w:type="dxa"/>
+              <w:bottom w:w="100" w:type="dxa"/>
+              <w:left w:w="120" w:type="dxa"/>
+              <w:right w:w="120" w:type="dxa"/>
+            </w:tcMar>
+          </w:tcPr>
+          <w:p>
+            <w:r>
+              <w:rPr>
+                <w:rFonts w:ascii="Calibri" w:hAnsi="Calibri"/>
+                <w:color w:val="282828"/>
+                <w:sz w:val="19"/>
+              </w:rPr>
+              <w:t>Windows Batch Script</w:t>
+            </w:r>
+          </w:p>
+        </w:tc>
+        <w:tc>
+          <w:tcPr>
+            <w:tcW w:type="dxa" w:w="3168"/>
+            <w:shd w:val="clear" w:color="auto" w:fill="F9FAFC"/>
+            <w:tcMar>
+              <w:top w:w="100" w:type="dxa"/>
+              <w:bottom w:w="100" w:type="dxa"/>
+              <w:left w:w="120" w:type="dxa"/>
+              <w:right w:w="120" w:type="dxa"/>
+            </w:tcMar>
+          </w:tcPr>
+          <w:p>
+            <w:r>
+              <w:rPr>
+                <w:rFonts w:ascii="Calibri" w:hAnsi="Calibri"/>
+                <w:color w:val="282828"/>
+                <w:sz w:val="19"/>
+              </w:rPr>
+              <w:t>backend_sync/run_sync_postgre.bat</w:t>
+            </w:r>
+          </w:p>
+        </w:tc>
+        <w:tc>
+          <w:tcPr>
+            <w:tcW w:type="dxa" w:w="2448"/>
+            <w:shd w:val="clear" w:color="auto" w:fill="F9FAFC"/>
+            <w:tcMar>
+              <w:top w:w="100" w:type="dxa"/>
+              <w:bottom w:w="100" w:type="dxa"/>
+              <w:left w:w="120" w:type="dxa"/>
+              <w:right w:w="120" w:type="dxa"/>
+            </w:tcMar>
+          </w:tcPr>
+          <w:p>
+            <w:r>
+              <w:rPr>
+                <w:rFonts w:ascii="Calibri" w:hAnsi="Calibri"/>
+                <w:color w:val="282828"/>
+                <w:sz w:val="19"/>
+              </w:rPr>
+              <w:t>Thiết lập PYTHONIOENCODING=utf-8, chuyển Cwd về thư mục backend_sync, gọi py sync_postgre.py và append output vào log.</w:t>
+            </w:r>
+          </w:p>
+        </w:tc>
+      </w:tr>
+      <w:tr>
+        <w:tc>
+          <w:tcPr>
+            <w:tcW w:type="dxa" w:w="2592"/>
+            <w:shd w:val="clear" w:color="auto" w:fill="FFFFFF"/>
+            <w:tcMar>
+              <w:top w:w="100" w:type="dxa"/>
+              <w:bottom w:w="100" w:type="dxa"/>
+              <w:left w:w="120" w:type="dxa"/>
+              <w:right w:w="120" w:type="dxa"/>
+            </w:tcMar>
+          </w:tcPr>
+          <w:p>
+            <w:r>
+              <w:rPr>
+                <w:rFonts w:ascii="Calibri" w:hAnsi="Calibri"/>
+                <w:color w:val="282828"/>
+                <w:sz w:val="19"/>
+              </w:rPr>
+              <w:t>PowerShell Setup</w:t>
+            </w:r>
+          </w:p>
+        </w:tc>
+        <w:tc>
+          <w:tcPr>
+            <w:tcW w:type="dxa" w:w="1872"/>
+            <w:shd w:val="clear" w:color="auto" w:fill="FFFFFF"/>
+            <w:tcMar>
+              <w:top w:w="100" w:type="dxa"/>
+              <w:bottom w:w="100" w:type="dxa"/>
+              <w:left w:w="120" w:type="dxa"/>
+              <w:right w:w="120" w:type="dxa"/>
+            </w:tcMar>
+          </w:tcPr>
+          <w:p>
+            <w:r>
+              <w:rPr>
+                <w:rFonts w:ascii="Calibri" w:hAnsi="Calibri"/>
+                <w:color w:val="282828"/>
+                <w:sz w:val="19"/>
+              </w:rPr>
+              <w:t>PowerShell Script</w:t>
+            </w:r>
+          </w:p>
+        </w:tc>
+        <w:tc>
+          <w:tcPr>
+            <w:tcW w:type="dxa" w:w="3168"/>
+            <w:shd w:val="clear" w:color="auto" w:fill="FFFFFF"/>
+            <w:tcMar>
+              <w:top w:w="100" w:type="dxa"/>
+              <w:bottom w:w="100" w:type="dxa"/>
+              <w:left w:w="120" w:type="dxa"/>
+              <w:right w:w="120" w:type="dxa"/>
+            </w:tcMar>
+          </w:tcPr>
+          <w:p>
+            <w:r>
+              <w:rPr>
+                <w:rFonts w:ascii="Calibri" w:hAnsi="Calibri"/>
+                <w:color w:val="282828"/>
+                <w:sz w:val="19"/>
+              </w:rPr>
+              <w:t>backend_sync/setup_sync_postgre_task.ps1</w:t>
+            </w:r>
+          </w:p>
+        </w:tc>
+        <w:tc>
+          <w:tcPr>
+            <w:tcW w:type="dxa" w:w="2448"/>
+            <w:shd w:val="clear" w:color="auto" w:fill="FFFFFF"/>
+            <w:tcMar>
+              <w:top w:w="100" w:type="dxa"/>
+              <w:bottom w:w="100" w:type="dxa"/>
+              <w:left w:w="120" w:type="dxa"/>
+              <w:right w:w="120" w:type="dxa"/>
+            </w:tcMar>
+          </w:tcPr>
+          <w:p>
+            <w:r>
+              <w:rPr>
+                <w:rFonts w:ascii="Calibri" w:hAnsi="Calibri"/>
+                <w:color w:val="282828"/>
+                <w:sz w:val="19"/>
+              </w:rPr>
+              <w:t>Kịch bản tự động hóa việc đăng ký Task vào Windows Task Scheduler bằng cmdlet Register-ScheduledTask.</w:t>
+            </w:r>
+          </w:p>
+        </w:tc>
+      </w:tr>
+      <w:tr>
+        <w:tc>
+          <w:tcPr>
+            <w:tcW w:type="dxa" w:w="2592"/>
+            <w:shd w:val="clear" w:color="auto" w:fill="F9FAFC"/>
+            <w:tcMar>
+              <w:top w:w="100" w:type="dxa"/>
+              <w:bottom w:w="100" w:type="dxa"/>
+              <w:left w:w="120" w:type="dxa"/>
+              <w:right w:w="120" w:type="dxa"/>
+            </w:tcMar>
+          </w:tcPr>
+          <w:p>
+            <w:r>
+              <w:rPr>
+                <w:rFonts w:ascii="Calibri" w:hAnsi="Calibri"/>
+                <w:color w:val="282828"/>
+                <w:sz w:val="19"/>
+              </w:rPr>
+              <w:t>Execution Log File</w:t>
+            </w:r>
+          </w:p>
+        </w:tc>
+        <w:tc>
+          <w:tcPr>
+            <w:tcW w:type="dxa" w:w="1872"/>
+            <w:shd w:val="clear" w:color="auto" w:fill="F9FAFC"/>
+            <w:tcMar>
+              <w:top w:w="100" w:type="dxa"/>
+              <w:bottom w:w="100" w:type="dxa"/>
+              <w:left w:w="120" w:type="dxa"/>
+              <w:right w:w="120" w:type="dxa"/>
+            </w:tcMar>
+          </w:tcPr>
+          <w:p>
+            <w:r>
+              <w:rPr>
+                <w:rFonts w:ascii="Calibri" w:hAnsi="Calibri"/>
+                <w:color w:val="282828"/>
+                <w:sz w:val="19"/>
+              </w:rPr>
+              <w:t>Flat File Log</w:t>
+            </w:r>
+          </w:p>
+        </w:tc>
+        <w:tc>
+          <w:tcPr>
+            <w:tcW w:type="dxa" w:w="3168"/>
+            <w:shd w:val="clear" w:color="auto" w:fill="F9FAFC"/>
+            <w:tcMar>
+              <w:top w:w="100" w:type="dxa"/>
+              <w:bottom w:w="100" w:type="dxa"/>
+              <w:left w:w="120" w:type="dxa"/>
+              <w:right w:w="120" w:type="dxa"/>
+            </w:tcMar>
+          </w:tcPr>
+          <w:p>
+            <w:r>
+              <w:rPr>
+                <w:rFonts w:ascii="Calibri" w:hAnsi="Calibri"/>
+                <w:color w:val="282828"/>
+                <w:sz w:val="19"/>
+              </w:rPr>
+              <w:t>backend_sync/sync_postgre.log</w:t>
+            </w:r>
+          </w:p>
+        </w:tc>
+        <w:tc>
+          <w:tcPr>
+            <w:tcW w:type="dxa" w:w="2448"/>
+            <w:shd w:val="clear" w:color="auto" w:fill="F9FAFC"/>
+            <w:tcMar>
+              <w:top w:w="100" w:type="dxa"/>
+              <w:bottom w:w="100" w:type="dxa"/>
+              <w:left w:w="120" w:type="dxa"/>
+              <w:right w:w="120" w:type="dxa"/>
+            </w:tcMar>
+          </w:tcPr>
+          <w:p>
+            <w:r>
+              <w:rPr>
+                <w:rFonts w:ascii="Calibri" w:hAnsi="Calibri"/>
+                <w:color w:val="282828"/>
+                <w:sz w:val="19"/>
+              </w:rPr>
+              <w:t>Ghi vết chi tiết từng phiên đồng bộ: mốc thời gian bắt đầu/kết thúc, các lỗi ngoại lệ (exception) và kết quả nén JSON/Git Push.</w:t>
+            </w:r>
+          </w:p>
+        </w:tc>
+      </w:tr>
+      <w:tr>
+        <w:tc>
+          <w:tcPr>
+            <w:tcW w:type="dxa" w:w="2592"/>
+            <w:shd w:val="clear" w:color="auto" w:fill="FFFFFF"/>
+            <w:tcMar>
+              <w:top w:w="100" w:type="dxa"/>
+              <w:bottom w:w="100" w:type="dxa"/>
+              <w:left w:w="120" w:type="dxa"/>
+              <w:right w:w="120" w:type="dxa"/>
+            </w:tcMar>
+          </w:tcPr>
+          <w:p>
+            <w:r>
+              <w:rPr>
+                <w:rFonts w:ascii="Calibri" w:hAnsi="Calibri"/>
+                <w:color w:val="282828"/>
+                <w:sz w:val="19"/>
+              </w:rPr>
+              <w:t>System Event Log</w:t>
+            </w:r>
+          </w:p>
+        </w:tc>
+        <w:tc>
+          <w:tcPr>
+            <w:tcW w:type="dxa" w:w="1872"/>
+            <w:shd w:val="clear" w:color="auto" w:fill="FFFFFF"/>
+            <w:tcMar>
+              <w:top w:w="100" w:type="dxa"/>
+              <w:bottom w:w="100" w:type="dxa"/>
+              <w:left w:w="120" w:type="dxa"/>
+              <w:right w:w="120" w:type="dxa"/>
+            </w:tcMar>
+          </w:tcPr>
+          <w:p>
+            <w:r>
+              <w:rPr>
+                <w:rFonts w:ascii="Calibri" w:hAnsi="Calibri"/>
+                <w:color w:val="282828"/>
+                <w:sz w:val="19"/>
+              </w:rPr>
+              <w:t>Windows Event Viewer</w:t>
+            </w:r>
+          </w:p>
+        </w:tc>
+        <w:tc>
+          <w:tcPr>
+            <w:tcW w:type="dxa" w:w="3168"/>
+            <w:shd w:val="clear" w:color="auto" w:fill="FFFFFF"/>
+            <w:tcMar>
+              <w:top w:w="100" w:type="dxa"/>
+              <w:bottom w:w="100" w:type="dxa"/>
+              <w:left w:w="120" w:type="dxa"/>
+              <w:right w:w="120" w:type="dxa"/>
+            </w:tcMar>
+          </w:tcPr>
+          <w:p>
+            <w:r>
+              <w:rPr>
+                <w:rFonts w:ascii="Calibri" w:hAnsi="Calibri"/>
+                <w:color w:val="282828"/>
+                <w:sz w:val="19"/>
+              </w:rPr>
+              <w:t>taskschd.msc (History Tab)</w:t>
+            </w:r>
+          </w:p>
+        </w:tc>
+        <w:tc>
+          <w:tcPr>
+            <w:tcW w:type="dxa" w:w="2448"/>
+            <w:shd w:val="clear" w:color="auto" w:fill="FFFFFF"/>
+            <w:tcMar>
+              <w:top w:w="100" w:type="dxa"/>
+              <w:bottom w:w="100" w:type="dxa"/>
+              <w:left w:w="120" w:type="dxa"/>
+              <w:right w:w="120" w:type="dxa"/>
+            </w:tcMar>
+          </w:tcPr>
+          <w:p>
+            <w:r>
+              <w:rPr>
+                <w:rFonts w:ascii="Calibri" w:hAnsi="Calibri"/>
+                <w:color w:val="282828"/>
+                <w:sz w:val="19"/>
+              </w:rPr>
+              <w:t>Theo dõi lịch sử kích hoạt của Windows, trạng thái Task (Ready/Running), mã thoát (Task Result code 0x0/Last Run Time).</w:t>
+            </w:r>
+          </w:p>
+        </w:tc>
+      </w:tr>
+    </w:tbl>
+    <w:p>
+      <w:pPr>
+        <w:spacing w:after="120"/>
+      </w:pPr>
+    </w:p>
+    <w:p>
+      <w:pPr>
         <w:spacing w:after="240"/>
       </w:pPr>
     </w:p>

</xml_diff>